<commit_message>
Tartalomjegyzék kiegésztítése + javítások
</commit_message>
<xml_diff>
--- a/docs/Idojaras_allomas_tartalomjegyzek.docx
+++ b/docs/Idojaras_allomas_tartalomjegyzek.docx
@@ -119,8 +119,6 @@
           <w:lang w:eastAsia="hu-HU"/>
         </w:rPr>
       </w:pPr>
-      <w:bookmarkStart w:id="0" w:name="_GoBack"/>
-      <w:bookmarkEnd w:id="0"/>
     </w:p>
     <w:p>
       <w:pPr>
@@ -236,10 +234,7 @@
         <w:ind w:left="708"/>
       </w:pPr>
       <w:r>
-        <w:t xml:space="preserve">A projekt során egy olyan rendszert </w:t>
-      </w:r>
-      <w:r>
-        <w:t>szeretnénk létrehozni, amely:</w:t>
+        <w:t>A projekt során egy olyan rendszert szeretnénk létrehozni, amely:</w:t>
       </w:r>
     </w:p>
     <w:p>
@@ -440,12 +435,6 @@
         <w:pStyle w:val="NormlWeb"/>
         <w:ind w:left="720"/>
       </w:pPr>
-    </w:p>
-    <w:p>
-      <w:pPr>
-        <w:pStyle w:val="NormlWeb"/>
-        <w:ind w:left="720"/>
-      </w:pPr>
       <w:r>
         <w:t xml:space="preserve">Az időjárás mérése a légkör fizikai állapotát jellemző meteorológiai elemek rendszeres megfigyelésén és rögzítésén alapul. A méréseket </w:t>
       </w:r>
@@ -507,31 +496,7 @@
           <w:szCs w:val="30"/>
           <w:lang w:eastAsia="hu-HU"/>
         </w:rPr>
-        <w:t xml:space="preserve">Meteorológiai adatok mérésénél a következő </w:t>
-      </w:r>
-      <w:proofErr w:type="gramStart"/>
-      <w:r>
-        <w:rPr>
-          <w:rFonts w:ascii="Times New Roman" w:eastAsia="Times New Roman" w:hAnsi="Times New Roman" w:cs="Times New Roman"/>
-          <w:bCs/>
-          <w:color w:val="000000" w:themeColor="text1"/>
-          <w:sz w:val="24"/>
-          <w:szCs w:val="30"/>
-          <w:lang w:eastAsia="hu-HU"/>
-        </w:rPr>
-        <w:t>alap elemek</w:t>
-      </w:r>
-      <w:proofErr w:type="gramEnd"/>
-      <w:r>
-        <w:rPr>
-          <w:rFonts w:ascii="Times New Roman" w:eastAsia="Times New Roman" w:hAnsi="Times New Roman" w:cs="Times New Roman"/>
-          <w:bCs/>
-          <w:color w:val="000000" w:themeColor="text1"/>
-          <w:sz w:val="24"/>
-          <w:szCs w:val="30"/>
-          <w:lang w:eastAsia="hu-HU"/>
-        </w:rPr>
-        <w:t xml:space="preserve"> mérését végezzük:</w:t>
+        <w:t>Meteorológiai adatok mérésénél a következő alapelemek mérését végezzük:</w:t>
       </w:r>
     </w:p>
     <w:p>
@@ -848,10 +813,7 @@
         <w:t>Légminőség</w:t>
       </w:r>
       <w:r>
-        <w:t>: A levegőben található különböző gázok</w:t>
-      </w:r>
-      <w:r>
-        <w:t>at és azok arányát mutatja meg.</w:t>
+        <w:t>: A levegőben található különböző gázokat és azok arányát mutatja meg.</w:t>
       </w:r>
     </w:p>
     <w:p>
@@ -1160,7 +1122,6 @@
           <w:szCs w:val="24"/>
           <w:lang w:eastAsia="hu-HU"/>
         </w:rPr>
-        <w:lastRenderedPageBreak/>
         <w:t>A modern </w:t>
       </w:r>
       <w:r>
@@ -1209,6 +1170,7 @@
           <w:szCs w:val="24"/>
           <w:lang w:eastAsia="hu-HU"/>
         </w:rPr>
+        <w:lastRenderedPageBreak/>
         <w:t>Szenzorok:</w:t>
       </w:r>
       <w:r>
@@ -1584,19 +1546,7 @@
         <w:t>Hardver</w:t>
       </w:r>
       <w:r>
-        <w:t xml:space="preserve">: </w:t>
-      </w:r>
-      <w:r>
-        <w:t>A rendszer architektúrája meghatározza a miniatűr időjárásállomás fő komponenseit és azok egymáshoz való kapcsolódását. A rendszer központi eleme egy mikrovezérlő, amely a szenzoroktól érkező adatokat fogadja és feldolgozza. A szenzorok folyamatosan mérik a környezeti paramétereket, például a hőmérsékletet, a páratartalmat és a légnyomást. A mikrovezérlő a begyűjtött adatokat</w:t>
-      </w:r>
-      <w:r>
-        <w:t>,</w:t>
-      </w:r>
-      <w:r>
-        <w:t xml:space="preserve"> feldolgozza</w:t>
-      </w:r>
-      <w:r>
-        <w:t xml:space="preserve"> és további feldolgozásra küldi a szerver felé. </w:t>
+        <w:t xml:space="preserve">: A rendszer architektúrája meghatározza a miniatűr időjárásállomás fő komponenseit és azok egymáshoz való kapcsolódását. A rendszer központi eleme egy mikrovezérlő, amely a szenzoroktól érkező adatokat fogadja és feldolgozza. A szenzorok folyamatosan mérik a környezeti paramétereket, például a hőmérsékletet, a páratartalmat és a légnyomást. A mikrovezérlő a begyűjtött adatokat, feldolgozza és további feldolgozásra küldi a szerver felé. </w:t>
       </w:r>
     </w:p>
     <w:p>
@@ -1655,10 +1605,7 @@
         <w:t>légnyomást</w:t>
       </w:r>
       <w:r>
-        <w:t xml:space="preserve"> stb. </w:t>
-      </w:r>
-      <w:r>
-        <w:t>A hardver tartalmazhat továbbá egy megjelenítő egységet, például egy kijelzőt, amelyen a mért adatok valós időben láthatók. A rendszer tápellátását egy stabil energiaforrás biztosítja, amely lehet USB tápegység vagy akkumulátor.</w:t>
+        <w:t xml:space="preserve"> stb. A hardver tartalmazhat továbbá egy megjelenítő egységet, például egy kijelzőt, amelyen a mért adatok valós időben láthatók. A rendszer tápellátását egy stabil energiaforrás biztosítja, amely lehet USB tápegység vagy akkumulátor.</w:t>
       </w:r>
     </w:p>
     <w:p>
@@ -1718,13 +1665,7 @@
         </w:rPr>
       </w:pPr>
       <w:r>
-        <w:t xml:space="preserve">Az adatgyűjtési folyamat során a rendszer meghatározott időközönként kiolvassa a szenzorok által mért értékeket. A mikrovezérlő a szenzoroktól érkező adatokat feldolgozza, </w:t>
-      </w:r>
-      <w:r>
-        <w:t xml:space="preserve">majd </w:t>
-      </w:r>
-      <w:r>
-        <w:t>továbbítja. A rendszer működése ciklikus jellegű: a szenzorok mérnek, az adatok feldolgozásra kerülnek, majd a rendszer egy újabb mérési ciklust indít.</w:t>
+        <w:t>Az adatgyűjtési folyamat során a rendszer meghatározott időközönként kiolvassa a szenzorok által mért értékeket. A mikrovezérlő a szenzoroktól érkező adatokat feldolgozza, majd továbbítja. A rendszer működése ciklikus jellegű: a szenzorok mérnek, az adatok feldolgozásra kerülnek, majd a rendszer egy újabb mérési ciklust indít.</w:t>
       </w:r>
     </w:p>
     <w:p>
@@ -2018,6 +1959,9 @@
         <w:lastRenderedPageBreak/>
         <w:t>A projekt további eredménye a rendszer működésének dokumentálása, amely tartalmazza a hardver felépítését, a kapcsolási rajzot, valamint a szoftver működésének leírását</w:t>
       </w:r>
+      <w:r>
+        <w:t>.</w:t>
+      </w:r>
     </w:p>
     <w:p>
       <w:pPr>
@@ -2028,43 +1972,110 @@
           <w:sz w:val="28"/>
         </w:rPr>
       </w:pPr>
+      <w:r>
+        <w:rPr>
+          <w:b/>
+          <w:sz w:val="28"/>
+        </w:rPr>
+        <w:t xml:space="preserve">A rendszer pontossága és </w:t>
+      </w:r>
+      <w:proofErr w:type="spellStart"/>
+      <w:r>
+        <w:rPr>
+          <w:b/>
+          <w:sz w:val="28"/>
+        </w:rPr>
+        <w:t>korlátai</w:t>
+      </w:r>
+      <w:proofErr w:type="spellEnd"/>
     </w:p>
     <w:p>
       <w:pPr>
         <w:pStyle w:val="NormlWeb"/>
         <w:ind w:left="708"/>
+      </w:pPr>
+      <w:r>
+        <w:t>A miniatűr időjárásállomás pontossága elsősorban a felhasznált szenzorok minőségétől és a rendszer kialakításától függ.</w:t>
+      </w:r>
+      <w:r>
+        <w:t xml:space="preserve"> </w:t>
+      </w:r>
+      <w:r>
+        <w:t>A rendszer várhatóan képes lesz a környezeti paraméterek, például a hőmérséklet, a páratartalom és a légnyomás mérésére elfogadható hibahatáron belül.</w:t>
+      </w:r>
+    </w:p>
+    <w:p>
+      <w:pPr>
+        <w:pStyle w:val="NormlWeb"/>
+        <w:ind w:left="708"/>
         <w:rPr>
           <w:b/>
           <w:sz w:val="28"/>
         </w:rPr>
       </w:pPr>
       <w:r>
-        <w:rPr>
-          <w:b/>
-          <w:sz w:val="28"/>
-        </w:rPr>
-        <w:t xml:space="preserve">A rendszer pontossága és </w:t>
+        <w:t xml:space="preserve">Fontos </w:t>
+      </w:r>
+      <w:r>
+        <w:t>viszont</w:t>
+      </w:r>
+      <w:r>
+        <w:t xml:space="preserve"> megjegyezni, hogy a projekt keretében készülő időjárásállomás nem helyettesíti a professzionális meteorológiai mérőállomásokat.</w:t>
+      </w:r>
+      <w:r>
+        <w:t xml:space="preserve"> </w:t>
+      </w:r>
+      <w:r>
+        <w:t>A rendszer egyik korlátja lehet a mérési pontosság, amely eltérhet a hivatalos meteorológiai állomások által szolgáltatott adatoktól. További korlátot jelenthet a rendszer fizikai kialakítása is, például</w:t>
+      </w:r>
+      <w:r>
+        <w:t>,</w:t>
+      </w:r>
+      <w:r>
+        <w:t xml:space="preserve"> ha a szenzorok nem megfelelően védettek a közvetlen napsugárzástól vagy a csapadéktól.</w:t>
+      </w:r>
+    </w:p>
+    <w:p>
+      <w:pPr>
+        <w:pStyle w:val="NormlWeb"/>
+        <w:ind w:left="708"/>
+      </w:pPr>
+      <w:r>
+        <w:t xml:space="preserve">Összességében a </w:t>
+      </w:r>
+      <w:r>
+        <w:t>projekt fejlesztése alatt biztos ütköz</w:t>
+      </w:r>
+      <w:r>
+        <w:t>ünk olyan</w:t>
+      </w:r>
+      <w:r>
+        <w:t xml:space="preserve"> különböző hardveres vagy szoftveres problémákba / korlátokba, amik</w:t>
+      </w:r>
+      <w:r>
+        <w:t>re nem biztos, hogy találunk megoldást</w:t>
+      </w:r>
+      <w:r>
+        <w:t xml:space="preserve">. Emiatt a projektnek biztos lesznek korlátjai, esetleg pontatlanságai. De </w:t>
+      </w:r>
+      <w:r>
+        <w:t>az ilyen esetleges</w:t>
+      </w:r>
+      <w:r>
+        <w:t xml:space="preserve"> problémáknak a </w:t>
       </w:r>
       <w:proofErr w:type="spellStart"/>
       <w:r>
-        <w:rPr>
-          <w:b/>
-          <w:sz w:val="28"/>
-        </w:rPr>
-        <w:t>korlátai</w:t>
+        <w:t>kiküböszbölése</w:t>
       </w:r>
       <w:proofErr w:type="spellEnd"/>
-    </w:p>
-    <w:p>
-      <w:pPr>
-        <w:pStyle w:val="NormlWeb"/>
-        <w:ind w:left="708"/>
-      </w:pPr>
-      <w:r>
-        <w:t xml:space="preserve">Mivel </w:t>
-      </w:r>
-      <w:r>
-        <w:t>ez egy kis szintű projekt, minden fontos részletre nem lehet kitérni</w:t>
+      <w:r>
+        <w:t xml:space="preserve"> fontos szempont</w:t>
+      </w:r>
+      <w:bookmarkStart w:id="0" w:name="_GoBack"/>
+      <w:bookmarkEnd w:id="0"/>
+      <w:r>
+        <w:t xml:space="preserve"> lesz a fejlesztés alatt.</w:t>
       </w:r>
     </w:p>
     <w:p>
@@ -2230,6 +2241,7 @@
           <w:rStyle w:val="Kiemels2"/>
           <w:sz w:val="32"/>
         </w:rPr>
+        <w:lastRenderedPageBreak/>
         <w:t>Összefoglalás</w:t>
       </w:r>
     </w:p>

</xml_diff>

<commit_message>
Cutting up the frame for 3D printing, copied the original and made it into a seperate file in case of any mistake is made.
</commit_message>
<xml_diff>
--- a/docs/Idojaras_allomas_tartalomjegyzek.docx
+++ b/docs/Idojaras_allomas_tartalomjegyzek.docx
@@ -2014,13 +2014,7 @@
         </w:rPr>
       </w:pPr>
       <w:r>
-        <w:t xml:space="preserve">Fontos </w:t>
-      </w:r>
-      <w:r>
-        <w:t>viszont</w:t>
-      </w:r>
-      <w:r>
-        <w:t xml:space="preserve"> megjegyezni, hogy a projekt keretében készülő időjárásállomás nem helyettesíti a professzionális meteorológiai mérőállomásokat.</w:t>
+        <w:t>Fontos viszont megjegyezni, hogy a projekt keretében készülő időjárásállomás nem helyettesíti a professzionális meteorológiai mérőállomásokat.</w:t>
       </w:r>
       <w:r>
         <w:t xml:space="preserve"> </w:t>
@@ -2062,36 +2056,34 @@
         <w:t>az ilyen esetleges</w:t>
       </w:r>
       <w:r>
-        <w:t xml:space="preserve"> problémáknak a </w:t>
-      </w:r>
-      <w:proofErr w:type="spellStart"/>
-      <w:r>
-        <w:t>kiküböszbölése</w:t>
-      </w:r>
-      <w:proofErr w:type="spellEnd"/>
-      <w:r>
-        <w:t xml:space="preserve"> fontos szempont</w:t>
+        <w:t xml:space="preserve"> problémáknak a kikü</w:t>
+      </w:r>
+      <w:r>
+        <w:t>szö</w:t>
+      </w:r>
+      <w:r>
+        <w:t>bölése fontos szempont</w:t>
+      </w:r>
+      <w:r>
+        <w:t xml:space="preserve"> lesz a fejlesztés alatt.</w:t>
+      </w:r>
+    </w:p>
+    <w:p>
+      <w:pPr>
+        <w:pStyle w:val="NormlWeb"/>
+        <w:rPr>
+          <w:sz w:val="32"/>
+        </w:rPr>
+      </w:pPr>
+      <w:r>
+        <w:rPr>
+          <w:rStyle w:val="Kiemels2"/>
+          <w:sz w:val="32"/>
+        </w:rPr>
+        <w:t>Fejlesztési lehetőségek</w:t>
       </w:r>
       <w:bookmarkStart w:id="0" w:name="_GoBack"/>
       <w:bookmarkEnd w:id="0"/>
-      <w:r>
-        <w:t xml:space="preserve"> lesz a fejlesztés alatt.</w:t>
-      </w:r>
-    </w:p>
-    <w:p>
-      <w:pPr>
-        <w:pStyle w:val="NormlWeb"/>
-        <w:rPr>
-          <w:sz w:val="32"/>
-        </w:rPr>
-      </w:pPr>
-      <w:r>
-        <w:rPr>
-          <w:rStyle w:val="Kiemels2"/>
-          <w:sz w:val="32"/>
-        </w:rPr>
-        <w:t>Fejlesztési lehetőségek</w:t>
-      </w:r>
     </w:p>
     <w:p>
       <w:pPr>

</xml_diff>